<commit_message>
otimizando paginas, criando perfil de convidado, consertando bug de rotas cortadas nos favoritos, criando authprovider para manipular usuario logado ou deslogado para testes
</commit_message>
<xml_diff>
--- a/possiveis upgrades no front end anotacoes.docx
+++ b/possiveis upgrades no front end anotacoes.docx
@@ -33,11 +33,34 @@
         <w:t>Definir ordem de prioridade na aparição das rotas,</w:t>
       </w:r>
     </w:p>
+    <w:p/>
+    <w:p/>
+    <w:p>
+      <w:pPr>
+        <w:rPr>
+          <w:b/>
+          <w:bCs/>
+        </w:rPr>
+      </w:pPr>
+      <w:r>
+        <w:rPr>
+          <w:b/>
+          <w:bCs/>
+        </w:rPr>
+        <w:t>Pagamentos feitos pelo usuário:</w:t>
+      </w:r>
+    </w:p>
     <w:p>
       <w:r>
         <w:t>Adicionar mais de 5 rotas se o usuário pagar algo do tipo.</w:t>
       </w:r>
     </w:p>
+    <w:p>
+      <w:r>
+        <w:t>Mais definições pra notificar</w:t>
+      </w:r>
+    </w:p>
+    <w:p/>
     <w:sectPr>
       <w:pgSz w:w="11906" w:h="16838"/>
       <w:pgMar w:top="1417" w:right="1701" w:bottom="1417" w:left="1701" w:header="708" w:footer="708" w:gutter="0"/>

</xml_diff>

<commit_message>
arquivo word que nao subiu
</commit_message>
<xml_diff>
--- a/possiveis upgrades no front end anotacoes.docx
+++ b/possiveis upgrades no front end anotacoes.docx
@@ -19,20 +19,15 @@
     </w:p>
     <w:p>
       <w:r>
-        <w:t xml:space="preserve">Filtro de busca </w:t>
-      </w:r>
-      <w:r>
-        <w:t xml:space="preserve">de rotas </w:t>
-      </w:r>
-      <w:r>
-        <w:t>em minhas rotas favoritas</w:t>
+        <w:t>Definir ordem de prioridade na aparição das rotas,</w:t>
       </w:r>
     </w:p>
     <w:p>
       <w:r>
-        <w:t>Definir ordem de prioridade na aparição das rotas,</w:t>
+        <w:t>Filtro para identificar a cidade do usuário e aparecer rotas disponíveis na cidade que ele se localiza</w:t>
       </w:r>
     </w:p>
+    <w:p/>
     <w:p/>
     <w:p/>
     <w:p>

</xml_diff>